<commit_message>
docs(evals): mt50 report renamed INTERIM -> FINAL; cross-refs updated
MT50_BOARD_FINAL_2026-07-27.docx (title now 'Final Report'). The
sweep-3 detailed report's MT50 column now carries final rates for all
23 models (no dashes) and its divergence section adds the board's most
extreme case: qwen3-next-80b-thinking 40% single-turn vs 94% mt50
(shared board lead). Codebase guide updated to the final 26-model
board.
</commit_message>
<xml_diff>
--- a/evals/reports/CODEBASE_GUIDE_2026-07-26.docx
+++ b/evals/reports/CODEBASE_GUIDE_2026-07-26.docx
@@ -63,7 +63,7 @@
         <w:pStyle w:val="ListBullet"/>
       </w:pPr>
       <w:r>
-        <w:t>A model benchmarking program: offline_eval/ (also new) — 23 models scored on the single-turn board and 19 on the 50-scenario multi-turn board (16 complete at time of writing), including local open-source models served through Ollama on Colab GPUs.</w:t>
+        <w:t>A model benchmarking program: offline_eval/ (also new) — 23 models scored on the single-turn board and 26 on the 50-scenario multi-turn board (complete, zero infrastructure errors), including local open-source models served through Ollama on Colab GPUs.</w:t>
       </w:r>
     </w:p>
     <w:p>
@@ -2357,7 +2357,7 @@
               <w:rPr>
                 <w:sz w:val="18"/>
               </w:rPr>
-              <w:t>Interim: gemini-3.5-flash 47/50; opus / sonnet / gemini-3.1-pro 46; qwen3:4b (4B, local) 44 — above production haiku (39). 3 legs still running</w:t>
+              <w:t>Final (26 models): qwen3-next-80b-thinking + gemini-3.5-flash 47/50 lead; glm-5 / opus / sonnet / gemini-3.1-pro 46; qwen3:4b (4B, local) 44 — above production haiku (39)</w:t>
             </w:r>
           </w:p>
         </w:tc>
@@ -2438,7 +2438,7 @@
         <w:pStyle w:val="ListBullet"/>
       </w:pPr>
       <w:r>
-        <w:t>offline_eval/multi_turn_results/MT50_BOARD_INTERIM_2026-07-26.docx — the current multi-turn board + how to read it</w:t>
+        <w:t>offline_eval/multi_turn_results/MT50_BOARD_FINAL_2026-07-27.docx — the current multi-turn board + how to read it</w:t>
       </w:r>
     </w:p>
     <w:p>

</xml_diff>